<commit_message>
Add/update resource data for FIAMaps
</commit_message>
<xml_diff>
--- a/eng/docx/004.content.docx
+++ b/eng/docx/004.content.docx
@@ -19,7 +19,7 @@
         <w:rPr>
           <w:lang w:val="en_US" w:bidi="en_US"/>
         </w:rPr>
-        <w:t>Resource: Maps (SRV)</w:t>
+        <w:t>Resource: Maps (FIA)</w:t>
       </w:r>
       <w:r>
         <w:rPr>
@@ -90,7 +90,7 @@
         <w:rPr>
           <w:lang w:val="en_US" w:bidi="en_US"/>
         </w:rPr>
-        <w:t>Maps (SRV)</w:t>
+        <w:t>Maps (FIA)</w:t>
       </w:r>
     </w:p>
     <w:p>
@@ -127,27 +127,7 @@
         <w:rPr>
           <w:lang w:val="en_US" w:bidi="en_US"/>
         </w:rPr>
-        <w:t>E</w:t>
-      </w:r>
-      <w:r>
-        <w:rPr>
-          <w:lang w:val="en_US" w:bidi="en_US"/>
-        </w:rPr>
-      </w:r>
-    </w:p>
-    <w:p>
-      <w:pPr/>
-      <w:r>
-        <w:rPr>
-          <w:lang w:val="en_US" w:bidi="en_US"/>
-        </w:rPr>
-      </w:r>
-      <w:r>
-        <w:rPr>
-          <w:i/>
-          <w:lang w:val="en_US" w:bidi="en_US"/>
-        </w:rPr>
-        <w:t>Edom and Seir, Edom, Seir, Median, Moab and Bozrah, Egypt, Emmaus</w:t>
+        <w:t>D</w:t>
       </w:r>
       <w:r>
         <w:rPr>
@@ -210,7 +190,7 @@
         <w:rPr>
           <w:lang w:val="en_US" w:bidi="en_US"/>
         </w:rPr>
-        <w:t>Edom and Seir</w:t>
+        <w:t>Descendants of Ham</w:t>
       </w:r>
       <w:r>
         <w:rPr>
@@ -228,6 +208,11 @@
         </w:rPr>
         <w:t>Image Content</w:t>
       </w:r>
+      <w:r>
+        <w:rPr>
+          <w:lang w:val="en_US" w:bidi="en_US"/>
+        </w:rPr>
+      </w:r>
     </w:p>
     <w:p>
       <w:pPr/>
@@ -241,7 +226,7 @@
       <w:r>
         <w:drawing>
           <wp:inline xmlns:a="http://schemas.openxmlformats.org/drawingml/2006/main" xmlns:pic="http://schemas.openxmlformats.org/drawingml/2006/picture">
-            <wp:extent cx="15240000" cy="20320000"/>
+            <wp:extent cx="6096000" cy="8128000"/>
             <wp:docPr id="1" name="Picture 1"/>
             <wp:cNvGraphicFramePr>
               <a:graphicFrameLocks noChangeAspect="1"/>
@@ -262,7 +247,7 @@
                   <pic:spPr>
                     <a:xfrm>
                       <a:off x="0" y="0"/>
-                      <a:ext cx="15240000" cy="20320000"/>
+                      <a:ext cx="6096000" cy="8128000"/>
                     </a:xfrm>
                     <a:prstGeom prst="rect"/>
                   </pic:spPr>
@@ -319,7 +304,7 @@
         <w:rPr>
           <w:lang w:val="en_US" w:bidi="en_US"/>
         </w:rPr>
-        <w:t>Edom, Seir, Median, Moab and Bozrah</w:t>
+        <w:t>Descendants of Shem</w:t>
       </w:r>
       <w:r>
         <w:rPr>
@@ -337,6 +322,11 @@
         </w:rPr>
         <w:t>Image Content</w:t>
       </w:r>
+      <w:r>
+        <w:rPr>
+          <w:lang w:val="en_US" w:bidi="en_US"/>
+        </w:rPr>
+      </w:r>
     </w:p>
     <w:p>
       <w:pPr/>
@@ -350,7 +340,7 @@
       <w:r>
         <w:drawing>
           <wp:inline xmlns:a="http://schemas.openxmlformats.org/drawingml/2006/main" xmlns:pic="http://schemas.openxmlformats.org/drawingml/2006/picture">
-            <wp:extent cx="15240000" cy="20320000"/>
+            <wp:extent cx="6096000" cy="4572000"/>
             <wp:docPr id="2" name="Picture 2"/>
             <wp:cNvGraphicFramePr>
               <a:graphicFrameLocks noChangeAspect="1"/>
@@ -371,7 +361,7 @@
                   <pic:spPr>
                     <a:xfrm>
                       <a:off x="0" y="0"/>
-                      <a:ext cx="15240000" cy="20320000"/>
+                      <a:ext cx="6096000" cy="4572000"/>
                     </a:xfrm>
                     <a:prstGeom prst="rect"/>
                   </pic:spPr>
@@ -428,7 +418,7 @@
         <w:rPr>
           <w:lang w:val="en_US" w:bidi="en_US"/>
         </w:rPr>
-        <w:t>Egypt</w:t>
+        <w:t>Detour to Ephesus</w:t>
       </w:r>
       <w:r>
         <w:rPr>
@@ -446,6 +436,11 @@
         </w:rPr>
         <w:t>Image Content</w:t>
       </w:r>
+      <w:r>
+        <w:rPr>
+          <w:lang w:val="en_US" w:bidi="en_US"/>
+        </w:rPr>
+      </w:r>
     </w:p>
     <w:p>
       <w:pPr/>
@@ -459,7 +454,7 @@
       <w:r>
         <w:drawing>
           <wp:inline xmlns:a="http://schemas.openxmlformats.org/drawingml/2006/main" xmlns:pic="http://schemas.openxmlformats.org/drawingml/2006/picture">
-            <wp:extent cx="15240000" cy="20320000"/>
+            <wp:extent cx="6096000" cy="4572000"/>
             <wp:docPr id="3" name="Picture 3"/>
             <wp:cNvGraphicFramePr>
               <a:graphicFrameLocks noChangeAspect="1"/>
@@ -480,7 +475,7 @@
                   <pic:spPr>
                     <a:xfrm>
                       <a:off x="0" y="0"/>
-                      <a:ext cx="15240000" cy="20320000"/>
+                      <a:ext cx="6096000" cy="4572000"/>
                     </a:xfrm>
                     <a:prstGeom prst="rect"/>
                   </pic:spPr>
@@ -499,115 +494,6 @@
         </w:rPr>
       </w:r>
       <w:hyperlink r:id="rId18">
-        <w:r>
-          <w:rPr>
-            <w:lang w:val="en_US" w:bidi="en_US"/>
-          </w:rPr>
-          <w:rPr>
-            <w:color w:val="0000EE"/>
-            <w:u w:val="single"/>
-          </w:rPr>
-          <w:t>link</w:t>
-        </w:r>
-      </w:hyperlink>
-      <w:r>
-        <w:rPr>
-          <w:lang w:val="en_US" w:bidi="en_US"/>
-        </w:rPr>
-      </w:r>
-      <w:r>
-        <w:rPr>
-          <w:lang w:val="en_US" w:bidi="en_US"/>
-        </w:rPr>
-      </w:r>
-    </w:p>
-    <w:p>
-      <w:pPr/>
-      <w:r>
-        <w:rPr>
-          <w:lang w:val="en_US" w:bidi="en_US"/>
-        </w:rPr>
-      </w:r>
-    </w:p>
-    <w:p>
-      <w:pPr>
-        <w:pStyle w:val="Heading2"/>
-      </w:pPr>
-      <w:r>
-        <w:rPr>
-          <w:lang w:val="en_US" w:bidi="en_US"/>
-        </w:rPr>
-        <w:t>Emmaus</w:t>
-      </w:r>
-      <w:r>
-        <w:rPr>
-          <w:lang w:val="en_US" w:bidi="en_US"/>
-        </w:rPr>
-      </w:r>
-    </w:p>
-    <w:p>
-      <w:pPr>
-        <w:pStyle w:val="Heading4"/>
-      </w:pPr>
-      <w:r>
-        <w:rPr>
-          <w:lang w:val="en_US" w:bidi="en_US"/>
-        </w:rPr>
-        <w:t>Image Content</w:t>
-      </w:r>
-    </w:p>
-    <w:p>
-      <w:pPr/>
-      <w:r>
-        <w:rPr>
-          <w:lang w:val="en_US" w:bidi="en_US"/>
-        </w:rPr>
-      </w:r>
-    </w:p>
-    <w:p>
-      <w:r>
-        <w:drawing>
-          <wp:inline xmlns:a="http://schemas.openxmlformats.org/drawingml/2006/main" xmlns:pic="http://schemas.openxmlformats.org/drawingml/2006/picture">
-            <wp:extent cx="20320000" cy="13550900"/>
-            <wp:docPr id="4" name="Picture 4"/>
-            <wp:cNvGraphicFramePr>
-              <a:graphicFrameLocks noChangeAspect="1"/>
-            </wp:cNvGraphicFramePr>
-            <a:graphic>
-              <a:graphicData uri="http://schemas.openxmlformats.org/drawingml/2006/picture">
-                <pic:pic>
-                  <pic:nvPicPr>
-                    <pic:cNvPr id="0" name="image.jpg"/>
-                    <pic:cNvPicPr/>
-                  </pic:nvPicPr>
-                  <pic:blipFill>
-                    <a:blip r:embed="rId19"/>
-                    <a:stretch>
-                      <a:fillRect/>
-                    </a:stretch>
-                  </pic:blipFill>
-                  <pic:spPr>
-                    <a:xfrm>
-                      <a:off x="0" y="0"/>
-                      <a:ext cx="20320000" cy="13550900"/>
-                    </a:xfrm>
-                    <a:prstGeom prst="rect"/>
-                  </pic:spPr>
-                </pic:pic>
-              </a:graphicData>
-            </a:graphic>
-          </wp:inline>
-        </w:drawing>
-      </w:r>
-    </w:p>
-    <w:p>
-      <w:pPr/>
-      <w:r>
-        <w:rPr>
-          <w:lang w:val="en_US" w:bidi="en_US"/>
-        </w:rPr>
-      </w:r>
-      <w:hyperlink r:id="rId20">
         <w:r>
           <w:rPr>
             <w:lang w:val="en_US" w:bidi="en_US"/>

</xml_diff>